<commit_message>
staging files ready for release
</commit_message>
<xml_diff>
--- a/usr/SAR/misc/style_SAP_en.docx
+++ b/usr/SAR/misc/style_SAP_en.docx
@@ -291,7 +291,7 @@
           </mc:Choice>
           <mc:Fallback>
             <w:pict>
-              <v:rect id="shape_0" ID="Shape1" path="m0,0l-2147483645,0l-2147483645,-2147483646l0,-2147483646xe" fillcolor="white" stroked="t" o:allowincell="f" style="position:absolute;margin-left:0pt;margin-top:-2.85pt;width:483.15pt;height:2.75pt;mso-wrap-style:none;v-text-anchor:middle;mso-position-vertical:top">
+              <v:rect id="shape_0" fillcolor="white" stroked="t" o:allowincell="f" style="position:absolute;margin-left:0pt;margin-top:-2.85pt;width:483.15pt;height:2.75pt;mso-wrap-style:none;v-text-anchor:middle;mso-position-vertical:top">
                 <v:fill o:detectmouseclick="t" type="solid" color2="black"/>
                 <v:stroke color="black" joinstyle="round" endcap="flat"/>
                 <w10:wrap type="square"/>
@@ -640,7 +640,7 @@
         <w:gridCol w:w="975"/>
         <w:gridCol w:w="973"/>
         <w:gridCol w:w="950"/>
-        <w:gridCol w:w="950"/>
+        <w:gridCol w:w="951"/>
       </w:tblGrid>
       <w:tr>
         <w:trPr/>
@@ -666,7 +666,6 @@
                 <w:b/>
                 <w:bCs/>
                 <w:i w:val="false"/>
-                <w:i w:val="false"/>
                 <w:iCs w:val="false"/>
                 <w:strike w:val="false"/>
                 <w:dstrike w:val="false"/>
@@ -719,7 +718,6 @@
                 <w:b/>
                 <w:bCs/>
                 <w:i w:val="false"/>
-                <w:i w:val="false"/>
                 <w:iCs w:val="false"/>
                 <w:strike w:val="false"/>
                 <w:dstrike w:val="false"/>
@@ -772,7 +770,6 @@
                 <w:b/>
                 <w:bCs/>
                 <w:i w:val="false"/>
-                <w:i w:val="false"/>
                 <w:iCs w:val="false"/>
                 <w:strike w:val="false"/>
                 <w:dstrike w:val="false"/>
@@ -825,7 +822,6 @@
                 <w:b/>
                 <w:bCs/>
                 <w:i w:val="false"/>
-                <w:i w:val="false"/>
                 <w:iCs w:val="false"/>
                 <w:strike w:val="false"/>
                 <w:dstrike w:val="false"/>
@@ -878,7 +874,6 @@
                 <w:b/>
                 <w:bCs/>
                 <w:i w:val="false"/>
-                <w:i w:val="false"/>
                 <w:iCs w:val="false"/>
                 <w:strike w:val="false"/>
                 <w:dstrike w:val="false"/>
@@ -931,7 +926,6 @@
                 <w:b/>
                 <w:bCs/>
                 <w:i w:val="false"/>
-                <w:i w:val="false"/>
                 <w:iCs w:val="false"/>
                 <w:strike w:val="false"/>
                 <w:dstrike w:val="false"/>
@@ -984,7 +978,6 @@
                 <w:b/>
                 <w:bCs/>
                 <w:i w:val="false"/>
-                <w:i w:val="false"/>
                 <w:iCs w:val="false"/>
                 <w:strike w:val="false"/>
                 <w:dstrike w:val="false"/>
@@ -1037,7 +1030,6 @@
                 <w:b/>
                 <w:bCs/>
                 <w:i w:val="false"/>
-                <w:i w:val="false"/>
                 <w:iCs w:val="false"/>
                 <w:strike w:val="false"/>
                 <w:dstrike w:val="false"/>
@@ -1090,7 +1082,6 @@
                 <w:b/>
                 <w:bCs/>
                 <w:i w:val="false"/>
-                <w:i w:val="false"/>
                 <w:iCs w:val="false"/>
                 <w:strike w:val="false"/>
                 <w:dstrike w:val="false"/>
@@ -1123,7 +1114,7 @@
         </w:tc>
         <w:tc>
           <w:tcPr>
-            <w:tcW w:w="950" w:type="dxa"/>
+            <w:tcW w:w="951" w:type="dxa"/>
             <w:tcBorders>
               <w:top w:val="single" w:sz="4" w:space="0" w:color="000000"/>
               <w:left w:val="single" w:sz="4" w:space="0" w:color="000000"/>
@@ -1144,7 +1135,6 @@
                 <w:b/>
                 <w:bCs/>
                 <w:i w:val="false"/>
-                <w:i w:val="false"/>
                 <w:iCs w:val="false"/>
                 <w:strike w:val="false"/>
                 <w:dstrike w:val="false"/>
@@ -1198,7 +1188,6 @@
                 <w:b w:val="false"/>
                 <w:bCs w:val="false"/>
                 <w:i w:val="false"/>
-                <w:i w:val="false"/>
                 <w:iCs w:val="false"/>
                 <w:strike w:val="false"/>
                 <w:dstrike w:val="false"/>
@@ -1249,7 +1238,6 @@
                 <w:b w:val="false"/>
                 <w:bCs w:val="false"/>
                 <w:i w:val="false"/>
-                <w:i w:val="false"/>
                 <w:iCs w:val="false"/>
                 <w:strike w:val="false"/>
                 <w:dstrike w:val="false"/>
@@ -1300,7 +1288,6 @@
                 <w:b w:val="false"/>
                 <w:bCs w:val="false"/>
                 <w:i w:val="false"/>
-                <w:i w:val="false"/>
                 <w:iCs w:val="false"/>
                 <w:strike w:val="false"/>
                 <w:dstrike w:val="false"/>
@@ -1351,7 +1338,6 @@
                 <w:b w:val="false"/>
                 <w:bCs w:val="false"/>
                 <w:i w:val="false"/>
-                <w:i w:val="false"/>
                 <w:iCs w:val="false"/>
                 <w:strike w:val="false"/>
                 <w:dstrike w:val="false"/>
@@ -1402,7 +1388,6 @@
                 <w:b w:val="false"/>
                 <w:bCs w:val="false"/>
                 <w:i w:val="false"/>
-                <w:i w:val="false"/>
                 <w:iCs w:val="false"/>
                 <w:strike w:val="false"/>
                 <w:dstrike w:val="false"/>
@@ -1453,7 +1438,6 @@
                 <w:b w:val="false"/>
                 <w:bCs w:val="false"/>
                 <w:i w:val="false"/>
-                <w:i w:val="false"/>
                 <w:iCs w:val="false"/>
                 <w:strike w:val="false"/>
                 <w:dstrike w:val="false"/>
@@ -1504,7 +1488,6 @@
                 <w:b w:val="false"/>
                 <w:bCs w:val="false"/>
                 <w:i w:val="false"/>
-                <w:i w:val="false"/>
                 <w:iCs w:val="false"/>
                 <w:strike w:val="false"/>
                 <w:dstrike w:val="false"/>
@@ -1555,7 +1538,6 @@
                 <w:b w:val="false"/>
                 <w:bCs w:val="false"/>
                 <w:i w:val="false"/>
-                <w:i w:val="false"/>
                 <w:iCs w:val="false"/>
                 <w:strike w:val="false"/>
                 <w:dstrike w:val="false"/>
@@ -1606,7 +1588,6 @@
                 <w:b w:val="false"/>
                 <w:bCs w:val="false"/>
                 <w:i w:val="false"/>
-                <w:i w:val="false"/>
                 <w:iCs w:val="false"/>
                 <w:strike w:val="false"/>
                 <w:dstrike w:val="false"/>
@@ -1639,7 +1620,7 @@
         </w:tc>
         <w:tc>
           <w:tcPr>
-            <w:tcW w:w="950" w:type="dxa"/>
+            <w:tcW w:w="951" w:type="dxa"/>
             <w:tcBorders>
               <w:left w:val="single" w:sz="4" w:space="0" w:color="000000"/>
               <w:bottom w:val="single" w:sz="4" w:space="0" w:color="000000"/>
@@ -1658,7 +1639,6 @@
                 <w:b w:val="false"/>
                 <w:bCs w:val="false"/>
                 <w:i w:val="false"/>
-                <w:i w:val="false"/>
                 <w:iCs w:val="false"/>
                 <w:strike w:val="false"/>
                 <w:dstrike w:val="false"/>
@@ -1712,7 +1692,6 @@
                 <w:b w:val="false"/>
                 <w:bCs w:val="false"/>
                 <w:i w:val="false"/>
-                <w:i w:val="false"/>
                 <w:iCs w:val="false"/>
                 <w:strike w:val="false"/>
                 <w:dstrike w:val="false"/>
@@ -1763,7 +1742,6 @@
                 <w:b w:val="false"/>
                 <w:bCs w:val="false"/>
                 <w:i w:val="false"/>
-                <w:i w:val="false"/>
                 <w:iCs w:val="false"/>
                 <w:strike w:val="false"/>
                 <w:dstrike w:val="false"/>
@@ -1814,7 +1792,6 @@
                 <w:b w:val="false"/>
                 <w:bCs w:val="false"/>
                 <w:i w:val="false"/>
-                <w:i w:val="false"/>
                 <w:iCs w:val="false"/>
                 <w:strike w:val="false"/>
                 <w:dstrike w:val="false"/>
@@ -1865,7 +1842,6 @@
                 <w:b w:val="false"/>
                 <w:bCs w:val="false"/>
                 <w:i w:val="false"/>
-                <w:i w:val="false"/>
                 <w:iCs w:val="false"/>
                 <w:strike w:val="false"/>
                 <w:dstrike w:val="false"/>
@@ -1916,7 +1892,6 @@
                 <w:b w:val="false"/>
                 <w:bCs w:val="false"/>
                 <w:i w:val="false"/>
-                <w:i w:val="false"/>
                 <w:iCs w:val="false"/>
                 <w:strike w:val="false"/>
                 <w:dstrike w:val="false"/>
@@ -1967,7 +1942,6 @@
                 <w:b w:val="false"/>
                 <w:bCs w:val="false"/>
                 <w:i w:val="false"/>
-                <w:i w:val="false"/>
                 <w:iCs w:val="false"/>
                 <w:strike w:val="false"/>
                 <w:dstrike w:val="false"/>
@@ -2018,7 +1992,6 @@
                 <w:b w:val="false"/>
                 <w:bCs w:val="false"/>
                 <w:i w:val="false"/>
-                <w:i w:val="false"/>
                 <w:iCs w:val="false"/>
                 <w:strike w:val="false"/>
                 <w:dstrike w:val="false"/>
@@ -2069,7 +2042,6 @@
                 <w:b w:val="false"/>
                 <w:bCs w:val="false"/>
                 <w:i w:val="false"/>
-                <w:i w:val="false"/>
                 <w:iCs w:val="false"/>
                 <w:strike w:val="false"/>
                 <w:dstrike w:val="false"/>
@@ -2120,7 +2092,6 @@
                 <w:b w:val="false"/>
                 <w:bCs w:val="false"/>
                 <w:i w:val="false"/>
-                <w:i w:val="false"/>
                 <w:iCs w:val="false"/>
                 <w:strike w:val="false"/>
                 <w:dstrike w:val="false"/>
@@ -2153,7 +2124,7 @@
         </w:tc>
         <w:tc>
           <w:tcPr>
-            <w:tcW w:w="950" w:type="dxa"/>
+            <w:tcW w:w="951" w:type="dxa"/>
             <w:tcBorders>
               <w:left w:val="single" w:sz="4" w:space="0" w:color="000000"/>
               <w:bottom w:val="single" w:sz="4" w:space="0" w:color="000000"/>
@@ -2172,7 +2143,6 @@
                 <w:b w:val="false"/>
                 <w:bCs w:val="false"/>
                 <w:i w:val="false"/>
-                <w:i w:val="false"/>
                 <w:iCs w:val="false"/>
                 <w:strike w:val="false"/>
                 <w:dstrike w:val="false"/>
@@ -2226,7 +2196,6 @@
                 <w:b w:val="false"/>
                 <w:bCs w:val="false"/>
                 <w:i w:val="false"/>
-                <w:i w:val="false"/>
                 <w:iCs w:val="false"/>
                 <w:strike w:val="false"/>
                 <w:dstrike w:val="false"/>
@@ -2277,7 +2246,6 @@
                 <w:b w:val="false"/>
                 <w:bCs w:val="false"/>
                 <w:i w:val="false"/>
-                <w:i w:val="false"/>
                 <w:iCs w:val="false"/>
                 <w:strike w:val="false"/>
                 <w:dstrike w:val="false"/>
@@ -2328,7 +2296,6 @@
                 <w:b w:val="false"/>
                 <w:bCs w:val="false"/>
                 <w:i w:val="false"/>
-                <w:i w:val="false"/>
                 <w:iCs w:val="false"/>
                 <w:strike w:val="false"/>
                 <w:dstrike w:val="false"/>
@@ -2379,7 +2346,6 @@
                 <w:b w:val="false"/>
                 <w:bCs w:val="false"/>
                 <w:i w:val="false"/>
-                <w:i w:val="false"/>
                 <w:iCs w:val="false"/>
                 <w:strike w:val="false"/>
                 <w:dstrike w:val="false"/>
@@ -2430,7 +2396,6 @@
                 <w:b w:val="false"/>
                 <w:bCs w:val="false"/>
                 <w:i w:val="false"/>
-                <w:i w:val="false"/>
                 <w:iCs w:val="false"/>
                 <w:strike w:val="false"/>
                 <w:dstrike w:val="false"/>
@@ -2481,7 +2446,6 @@
                 <w:b w:val="false"/>
                 <w:bCs w:val="false"/>
                 <w:i w:val="false"/>
-                <w:i w:val="false"/>
                 <w:iCs w:val="false"/>
                 <w:strike w:val="false"/>
                 <w:dstrike w:val="false"/>
@@ -2532,7 +2496,6 @@
                 <w:b w:val="false"/>
                 <w:bCs w:val="false"/>
                 <w:i w:val="false"/>
-                <w:i w:val="false"/>
                 <w:iCs w:val="false"/>
                 <w:strike w:val="false"/>
                 <w:dstrike w:val="false"/>
@@ -2583,7 +2546,6 @@
                 <w:b w:val="false"/>
                 <w:bCs w:val="false"/>
                 <w:i w:val="false"/>
-                <w:i w:val="false"/>
                 <w:iCs w:val="false"/>
                 <w:strike w:val="false"/>
                 <w:dstrike w:val="false"/>
@@ -2634,7 +2596,6 @@
                 <w:b w:val="false"/>
                 <w:bCs w:val="false"/>
                 <w:i w:val="false"/>
-                <w:i w:val="false"/>
                 <w:iCs w:val="false"/>
                 <w:strike w:val="false"/>
                 <w:dstrike w:val="false"/>
@@ -2667,7 +2628,7 @@
         </w:tc>
         <w:tc>
           <w:tcPr>
-            <w:tcW w:w="950" w:type="dxa"/>
+            <w:tcW w:w="951" w:type="dxa"/>
             <w:tcBorders>
               <w:left w:val="single" w:sz="4" w:space="0" w:color="000000"/>
               <w:bottom w:val="single" w:sz="4" w:space="0" w:color="000000"/>
@@ -2686,7 +2647,6 @@
                 <w:b w:val="false"/>
                 <w:bCs w:val="false"/>
                 <w:i w:val="false"/>
-                <w:i w:val="false"/>
                 <w:iCs w:val="false"/>
                 <w:strike w:val="false"/>
                 <w:dstrike w:val="false"/>
@@ -2740,7 +2700,6 @@
                 <w:b w:val="false"/>
                 <w:bCs w:val="false"/>
                 <w:i w:val="false"/>
-                <w:i w:val="false"/>
                 <w:iCs w:val="false"/>
                 <w:strike w:val="false"/>
                 <w:dstrike w:val="false"/>
@@ -2791,7 +2750,6 @@
                 <w:b w:val="false"/>
                 <w:bCs w:val="false"/>
                 <w:i w:val="false"/>
-                <w:i w:val="false"/>
                 <w:iCs w:val="false"/>
                 <w:strike w:val="false"/>
                 <w:dstrike w:val="false"/>
@@ -2842,7 +2800,6 @@
                 <w:b w:val="false"/>
                 <w:bCs w:val="false"/>
                 <w:i w:val="false"/>
-                <w:i w:val="false"/>
                 <w:iCs w:val="false"/>
                 <w:strike w:val="false"/>
                 <w:dstrike w:val="false"/>
@@ -2893,7 +2850,6 @@
                 <w:b w:val="false"/>
                 <w:bCs w:val="false"/>
                 <w:i w:val="false"/>
-                <w:i w:val="false"/>
                 <w:iCs w:val="false"/>
                 <w:strike w:val="false"/>
                 <w:dstrike w:val="false"/>
@@ -2944,7 +2900,6 @@
                 <w:b w:val="false"/>
                 <w:bCs w:val="false"/>
                 <w:i w:val="false"/>
-                <w:i w:val="false"/>
                 <w:iCs w:val="false"/>
                 <w:strike w:val="false"/>
                 <w:dstrike w:val="false"/>
@@ -2995,7 +2950,6 @@
                 <w:b w:val="false"/>
                 <w:bCs w:val="false"/>
                 <w:i w:val="false"/>
-                <w:i w:val="false"/>
                 <w:iCs w:val="false"/>
                 <w:strike w:val="false"/>
                 <w:dstrike w:val="false"/>
@@ -3046,7 +3000,6 @@
                 <w:b w:val="false"/>
                 <w:bCs w:val="false"/>
                 <w:i w:val="false"/>
-                <w:i w:val="false"/>
                 <w:iCs w:val="false"/>
                 <w:strike w:val="false"/>
                 <w:dstrike w:val="false"/>
@@ -3097,7 +3050,6 @@
                 <w:b w:val="false"/>
                 <w:bCs w:val="false"/>
                 <w:i w:val="false"/>
-                <w:i w:val="false"/>
                 <w:iCs w:val="false"/>
                 <w:strike w:val="false"/>
                 <w:dstrike w:val="false"/>
@@ -3148,7 +3100,6 @@
                 <w:b w:val="false"/>
                 <w:bCs w:val="false"/>
                 <w:i w:val="false"/>
-                <w:i w:val="false"/>
                 <w:iCs w:val="false"/>
                 <w:strike w:val="false"/>
                 <w:dstrike w:val="false"/>
@@ -3181,7 +3132,7 @@
         </w:tc>
         <w:tc>
           <w:tcPr>
-            <w:tcW w:w="950" w:type="dxa"/>
+            <w:tcW w:w="951" w:type="dxa"/>
             <w:tcBorders>
               <w:left w:val="single" w:sz="4" w:space="0" w:color="000000"/>
               <w:bottom w:val="single" w:sz="4" w:space="0" w:color="000000"/>
@@ -3200,7 +3151,6 @@
                 <w:b w:val="false"/>
                 <w:bCs w:val="false"/>
                 <w:i w:val="false"/>
-                <w:i w:val="false"/>
                 <w:iCs w:val="false"/>
                 <w:strike w:val="false"/>
                 <w:dstrike w:val="false"/>
@@ -3254,7 +3204,6 @@
                 <w:b w:val="false"/>
                 <w:bCs w:val="false"/>
                 <w:i w:val="false"/>
-                <w:i w:val="false"/>
                 <w:iCs w:val="false"/>
                 <w:strike w:val="false"/>
                 <w:dstrike w:val="false"/>
@@ -3305,7 +3254,6 @@
                 <w:b w:val="false"/>
                 <w:bCs w:val="false"/>
                 <w:i w:val="false"/>
-                <w:i w:val="false"/>
                 <w:iCs w:val="false"/>
                 <w:strike w:val="false"/>
                 <w:dstrike w:val="false"/>
@@ -3356,7 +3304,6 @@
                 <w:b w:val="false"/>
                 <w:bCs w:val="false"/>
                 <w:i w:val="false"/>
-                <w:i w:val="false"/>
                 <w:iCs w:val="false"/>
                 <w:strike w:val="false"/>
                 <w:dstrike w:val="false"/>
@@ -3407,7 +3354,6 @@
                 <w:b w:val="false"/>
                 <w:bCs w:val="false"/>
                 <w:i w:val="false"/>
-                <w:i w:val="false"/>
                 <w:iCs w:val="false"/>
                 <w:strike w:val="false"/>
                 <w:dstrike w:val="false"/>
@@ -3458,7 +3404,6 @@
                 <w:b w:val="false"/>
                 <w:bCs w:val="false"/>
                 <w:i w:val="false"/>
-                <w:i w:val="false"/>
                 <w:iCs w:val="false"/>
                 <w:strike w:val="false"/>
                 <w:dstrike w:val="false"/>
@@ -3509,7 +3454,6 @@
                 <w:b w:val="false"/>
                 <w:bCs w:val="false"/>
                 <w:i w:val="false"/>
-                <w:i w:val="false"/>
                 <w:iCs w:val="false"/>
                 <w:strike w:val="false"/>
                 <w:dstrike w:val="false"/>
@@ -3560,7 +3504,6 @@
                 <w:b w:val="false"/>
                 <w:bCs w:val="false"/>
                 <w:i w:val="false"/>
-                <w:i w:val="false"/>
                 <w:iCs w:val="false"/>
                 <w:strike w:val="false"/>
                 <w:dstrike w:val="false"/>
@@ -3611,7 +3554,6 @@
                 <w:b w:val="false"/>
                 <w:bCs w:val="false"/>
                 <w:i w:val="false"/>
-                <w:i w:val="false"/>
                 <w:iCs w:val="false"/>
                 <w:strike w:val="false"/>
                 <w:dstrike w:val="false"/>
@@ -3662,7 +3604,6 @@
                 <w:b w:val="false"/>
                 <w:bCs w:val="false"/>
                 <w:i w:val="false"/>
-                <w:i w:val="false"/>
                 <w:iCs w:val="false"/>
                 <w:strike w:val="false"/>
                 <w:dstrike w:val="false"/>
@@ -3695,7 +3636,7 @@
         </w:tc>
         <w:tc>
           <w:tcPr>
-            <w:tcW w:w="950" w:type="dxa"/>
+            <w:tcW w:w="951" w:type="dxa"/>
             <w:tcBorders>
               <w:left w:val="single" w:sz="4" w:space="0" w:color="000000"/>
               <w:bottom w:val="single" w:sz="4" w:space="0" w:color="000000"/>
@@ -3713,7 +3654,6 @@
                 <w:rFonts w:ascii="Ubuntu" w:hAnsi="Ubuntu"/>
                 <w:b w:val="false"/>
                 <w:bCs w:val="false"/>
-                <w:i w:val="false"/>
                 <w:i w:val="false"/>
                 <w:iCs w:val="false"/>
                 <w:strike w:val="false"/>
@@ -3795,7 +3735,7 @@
         <w:gridCol w:w="1071"/>
         <w:gridCol w:w="1072"/>
         <w:gridCol w:w="1077"/>
-        <w:gridCol w:w="1064"/>
+        <w:gridCol w:w="1065"/>
       </w:tblGrid>
       <w:tr>
         <w:trPr/>
@@ -3817,7 +3757,6 @@
                 <w:b/>
                 <w:bCs/>
                 <w:i w:val="false"/>
-                <w:i w:val="false"/>
                 <w:iCs w:val="false"/>
                 <w:sz w:val="22"/>
                 <w:szCs w:val="22"/>
@@ -3852,7 +3791,6 @@
                 <w:b/>
                 <w:bCs/>
                 <w:i w:val="false"/>
-                <w:i w:val="false"/>
                 <w:iCs w:val="false"/>
                 <w:sz w:val="22"/>
                 <w:szCs w:val="22"/>
@@ -3887,7 +3825,6 @@
                 <w:b/>
                 <w:bCs/>
                 <w:i w:val="false"/>
-                <w:i w:val="false"/>
                 <w:iCs w:val="false"/>
                 <w:sz w:val="22"/>
                 <w:szCs w:val="22"/>
@@ -3922,7 +3859,6 @@
                 <w:b/>
                 <w:bCs/>
                 <w:i w:val="false"/>
-                <w:i w:val="false"/>
                 <w:iCs w:val="false"/>
                 <w:sz w:val="22"/>
                 <w:szCs w:val="22"/>
@@ -3957,7 +3893,6 @@
                 <w:b/>
                 <w:bCs/>
                 <w:i w:val="false"/>
-                <w:i w:val="false"/>
                 <w:iCs w:val="false"/>
                 <w:sz w:val="22"/>
                 <w:szCs w:val="22"/>
@@ -3992,7 +3927,6 @@
                 <w:b/>
                 <w:bCs/>
                 <w:i w:val="false"/>
-                <w:i w:val="false"/>
                 <w:iCs w:val="false"/>
                 <w:sz w:val="22"/>
                 <w:szCs w:val="22"/>
@@ -4027,7 +3961,6 @@
                 <w:b/>
                 <w:bCs/>
                 <w:i w:val="false"/>
-                <w:i w:val="false"/>
                 <w:iCs w:val="false"/>
                 <w:sz w:val="22"/>
                 <w:szCs w:val="22"/>
@@ -4062,7 +3995,6 @@
                 <w:b/>
                 <w:bCs/>
                 <w:i w:val="false"/>
-                <w:i w:val="false"/>
                 <w:iCs w:val="false"/>
                 <w:sz w:val="22"/>
                 <w:szCs w:val="22"/>
@@ -4082,7 +4014,7 @@
         </w:tc>
         <w:tc>
           <w:tcPr>
-            <w:tcW w:w="1064" w:type="dxa"/>
+            <w:tcW w:w="1065" w:type="dxa"/>
             <w:tcBorders>
               <w:top w:val="single" w:sz="2" w:space="0" w:color="000000"/>
               <w:left w:val="single" w:sz="2" w:space="0" w:color="000000"/>
@@ -4098,7 +4030,6 @@
                 <w:b/>
                 <w:bCs/>
                 <w:i w:val="false"/>
-                <w:i w:val="false"/>
                 <w:iCs w:val="false"/>
                 <w:sz w:val="22"/>
                 <w:szCs w:val="22"/>
@@ -4135,7 +4066,6 @@
                 <w:b w:val="false"/>
                 <w:bCs w:val="false"/>
                 <w:i w:val="false"/>
-                <w:i w:val="false"/>
                 <w:iCs w:val="false"/>
                 <w:sz w:val="22"/>
                 <w:szCs w:val="22"/>
@@ -4169,7 +4099,6 @@
                 <w:b w:val="false"/>
                 <w:bCs w:val="false"/>
                 <w:i w:val="false"/>
-                <w:i w:val="false"/>
                 <w:iCs w:val="false"/>
                 <w:sz w:val="22"/>
                 <w:szCs w:val="22"/>
@@ -4203,7 +4132,6 @@
                 <w:b w:val="false"/>
                 <w:bCs w:val="false"/>
                 <w:i w:val="false"/>
-                <w:i w:val="false"/>
                 <w:iCs w:val="false"/>
                 <w:sz w:val="22"/>
                 <w:szCs w:val="22"/>
@@ -4237,7 +4165,6 @@
                 <w:b w:val="false"/>
                 <w:bCs w:val="false"/>
                 <w:i w:val="false"/>
-                <w:i w:val="false"/>
                 <w:iCs w:val="false"/>
                 <w:sz w:val="22"/>
                 <w:szCs w:val="22"/>
@@ -4271,7 +4198,6 @@
                 <w:b w:val="false"/>
                 <w:bCs w:val="false"/>
                 <w:i w:val="false"/>
-                <w:i w:val="false"/>
                 <w:iCs w:val="false"/>
                 <w:sz w:val="22"/>
                 <w:szCs w:val="22"/>
@@ -4305,7 +4231,6 @@
                 <w:b w:val="false"/>
                 <w:bCs w:val="false"/>
                 <w:i w:val="false"/>
-                <w:i w:val="false"/>
                 <w:iCs w:val="false"/>
                 <w:sz w:val="22"/>
                 <w:szCs w:val="22"/>
@@ -4339,7 +4264,6 @@
                 <w:b w:val="false"/>
                 <w:bCs w:val="false"/>
                 <w:i w:val="false"/>
-                <w:i w:val="false"/>
                 <w:iCs w:val="false"/>
                 <w:sz w:val="22"/>
                 <w:szCs w:val="22"/>
@@ -4373,27 +4297,26 @@
                 <w:b w:val="false"/>
                 <w:bCs w:val="false"/>
                 <w:i w:val="false"/>
-                <w:i w:val="false"/>
-                <w:iCs w:val="false"/>
-                <w:sz w:val="22"/>
-                <w:szCs w:val="22"/>
-              </w:rPr>
-            </w:pPr>
-            <w:r>
-              <w:rPr>
-                <w:b w:val="false"/>
-                <w:bCs w:val="false"/>
-                <w:i w:val="false"/>
-                <w:iCs w:val="false"/>
-                <w:sz w:val="22"/>
-                <w:szCs w:val="22"/>
-              </w:rPr>
-            </w:r>
-          </w:p>
-        </w:tc>
-        <w:tc>
-          <w:tcPr>
-            <w:tcW w:w="1064" w:type="dxa"/>
+                <w:iCs w:val="false"/>
+                <w:sz w:val="22"/>
+                <w:szCs w:val="22"/>
+              </w:rPr>
+            </w:pPr>
+            <w:r>
+              <w:rPr>
+                <w:b w:val="false"/>
+                <w:bCs w:val="false"/>
+                <w:i w:val="false"/>
+                <w:iCs w:val="false"/>
+                <w:sz w:val="22"/>
+                <w:szCs w:val="22"/>
+              </w:rPr>
+            </w:r>
+          </w:p>
+        </w:tc>
+        <w:tc>
+          <w:tcPr>
+            <w:tcW w:w="1065" w:type="dxa"/>
             <w:tcBorders>
               <w:left w:val="single" w:sz="2" w:space="0" w:color="000000"/>
               <w:bottom w:val="single" w:sz="2" w:space="0" w:color="000000"/>
@@ -4408,7 +4331,6 @@
                 <w:b w:val="false"/>
                 <w:bCs w:val="false"/>
                 <w:i w:val="false"/>
-                <w:i w:val="false"/>
                 <w:iCs w:val="false"/>
                 <w:sz w:val="22"/>
                 <w:szCs w:val="22"/>
@@ -4445,7 +4367,6 @@
                 <w:b w:val="false"/>
                 <w:bCs w:val="false"/>
                 <w:i w:val="false"/>
-                <w:i w:val="false"/>
                 <w:iCs w:val="false"/>
                 <w:sz w:val="22"/>
                 <w:szCs w:val="22"/>
@@ -4479,7 +4400,6 @@
                 <w:b w:val="false"/>
                 <w:bCs w:val="false"/>
                 <w:i w:val="false"/>
-                <w:i w:val="false"/>
                 <w:iCs w:val="false"/>
                 <w:sz w:val="22"/>
                 <w:szCs w:val="22"/>
@@ -4513,7 +4433,6 @@
                 <w:b w:val="false"/>
                 <w:bCs w:val="false"/>
                 <w:i w:val="false"/>
-                <w:i w:val="false"/>
                 <w:iCs w:val="false"/>
                 <w:sz w:val="22"/>
                 <w:szCs w:val="22"/>
@@ -4547,7 +4466,6 @@
                 <w:b w:val="false"/>
                 <w:bCs w:val="false"/>
                 <w:i w:val="false"/>
-                <w:i w:val="false"/>
                 <w:iCs w:val="false"/>
                 <w:sz w:val="22"/>
                 <w:szCs w:val="22"/>
@@ -4581,7 +4499,6 @@
                 <w:b w:val="false"/>
                 <w:bCs w:val="false"/>
                 <w:i w:val="false"/>
-                <w:i w:val="false"/>
                 <w:iCs w:val="false"/>
                 <w:sz w:val="22"/>
                 <w:szCs w:val="22"/>
@@ -4615,7 +4532,6 @@
                 <w:b w:val="false"/>
                 <w:bCs w:val="false"/>
                 <w:i w:val="false"/>
-                <w:i w:val="false"/>
                 <w:iCs w:val="false"/>
                 <w:sz w:val="22"/>
                 <w:szCs w:val="22"/>
@@ -4649,7 +4565,6 @@
                 <w:b w:val="false"/>
                 <w:bCs w:val="false"/>
                 <w:i w:val="false"/>
-                <w:i w:val="false"/>
                 <w:iCs w:val="false"/>
                 <w:sz w:val="22"/>
                 <w:szCs w:val="22"/>
@@ -4683,27 +4598,26 @@
                 <w:b w:val="false"/>
                 <w:bCs w:val="false"/>
                 <w:i w:val="false"/>
-                <w:i w:val="false"/>
-                <w:iCs w:val="false"/>
-                <w:sz w:val="22"/>
-                <w:szCs w:val="22"/>
-              </w:rPr>
-            </w:pPr>
-            <w:r>
-              <w:rPr>
-                <w:b w:val="false"/>
-                <w:bCs w:val="false"/>
-                <w:i w:val="false"/>
-                <w:iCs w:val="false"/>
-                <w:sz w:val="22"/>
-                <w:szCs w:val="22"/>
-              </w:rPr>
-            </w:r>
-          </w:p>
-        </w:tc>
-        <w:tc>
-          <w:tcPr>
-            <w:tcW w:w="1064" w:type="dxa"/>
+                <w:iCs w:val="false"/>
+                <w:sz w:val="22"/>
+                <w:szCs w:val="22"/>
+              </w:rPr>
+            </w:pPr>
+            <w:r>
+              <w:rPr>
+                <w:b w:val="false"/>
+                <w:bCs w:val="false"/>
+                <w:i w:val="false"/>
+                <w:iCs w:val="false"/>
+                <w:sz w:val="22"/>
+                <w:szCs w:val="22"/>
+              </w:rPr>
+            </w:r>
+          </w:p>
+        </w:tc>
+        <w:tc>
+          <w:tcPr>
+            <w:tcW w:w="1065" w:type="dxa"/>
             <w:tcBorders>
               <w:left w:val="single" w:sz="2" w:space="0" w:color="000000"/>
               <w:bottom w:val="single" w:sz="2" w:space="0" w:color="000000"/>
@@ -4718,7 +4632,6 @@
                 <w:b w:val="false"/>
                 <w:bCs w:val="false"/>
                 <w:i w:val="false"/>
-                <w:i w:val="false"/>
                 <w:iCs w:val="false"/>
                 <w:sz w:val="22"/>
                 <w:szCs w:val="22"/>
@@ -4755,7 +4668,6 @@
                 <w:b w:val="false"/>
                 <w:bCs w:val="false"/>
                 <w:i w:val="false"/>
-                <w:i w:val="false"/>
                 <w:iCs w:val="false"/>
                 <w:sz w:val="22"/>
                 <w:szCs w:val="22"/>
@@ -4789,7 +4701,6 @@
                 <w:b w:val="false"/>
                 <w:bCs w:val="false"/>
                 <w:i w:val="false"/>
-                <w:i w:val="false"/>
                 <w:iCs w:val="false"/>
                 <w:sz w:val="22"/>
                 <w:szCs w:val="22"/>
@@ -4823,7 +4734,6 @@
                 <w:b w:val="false"/>
                 <w:bCs w:val="false"/>
                 <w:i w:val="false"/>
-                <w:i w:val="false"/>
                 <w:iCs w:val="false"/>
                 <w:sz w:val="22"/>
                 <w:szCs w:val="22"/>
@@ -4857,7 +4767,6 @@
                 <w:b w:val="false"/>
                 <w:bCs w:val="false"/>
                 <w:i w:val="false"/>
-                <w:i w:val="false"/>
                 <w:iCs w:val="false"/>
                 <w:sz w:val="22"/>
                 <w:szCs w:val="22"/>
@@ -4891,7 +4800,6 @@
                 <w:b w:val="false"/>
                 <w:bCs w:val="false"/>
                 <w:i w:val="false"/>
-                <w:i w:val="false"/>
                 <w:iCs w:val="false"/>
                 <w:sz w:val="22"/>
                 <w:szCs w:val="22"/>
@@ -4925,7 +4833,6 @@
                 <w:b w:val="false"/>
                 <w:bCs w:val="false"/>
                 <w:i w:val="false"/>
-                <w:i w:val="false"/>
                 <w:iCs w:val="false"/>
                 <w:sz w:val="22"/>
                 <w:szCs w:val="22"/>
@@ -4959,7 +4866,6 @@
                 <w:b w:val="false"/>
                 <w:bCs w:val="false"/>
                 <w:i w:val="false"/>
-                <w:i w:val="false"/>
                 <w:iCs w:val="false"/>
                 <w:sz w:val="22"/>
                 <w:szCs w:val="22"/>
@@ -4993,27 +4899,26 @@
                 <w:b w:val="false"/>
                 <w:bCs w:val="false"/>
                 <w:i w:val="false"/>
-                <w:i w:val="false"/>
-                <w:iCs w:val="false"/>
-                <w:sz w:val="22"/>
-                <w:szCs w:val="22"/>
-              </w:rPr>
-            </w:pPr>
-            <w:r>
-              <w:rPr>
-                <w:b w:val="false"/>
-                <w:bCs w:val="false"/>
-                <w:i w:val="false"/>
-                <w:iCs w:val="false"/>
-                <w:sz w:val="22"/>
-                <w:szCs w:val="22"/>
-              </w:rPr>
-            </w:r>
-          </w:p>
-        </w:tc>
-        <w:tc>
-          <w:tcPr>
-            <w:tcW w:w="1064" w:type="dxa"/>
+                <w:iCs w:val="false"/>
+                <w:sz w:val="22"/>
+                <w:szCs w:val="22"/>
+              </w:rPr>
+            </w:pPr>
+            <w:r>
+              <w:rPr>
+                <w:b w:val="false"/>
+                <w:bCs w:val="false"/>
+                <w:i w:val="false"/>
+                <w:iCs w:val="false"/>
+                <w:sz w:val="22"/>
+                <w:szCs w:val="22"/>
+              </w:rPr>
+            </w:r>
+          </w:p>
+        </w:tc>
+        <w:tc>
+          <w:tcPr>
+            <w:tcW w:w="1065" w:type="dxa"/>
             <w:tcBorders>
               <w:left w:val="single" w:sz="2" w:space="0" w:color="000000"/>
               <w:bottom w:val="single" w:sz="2" w:space="0" w:color="000000"/>
@@ -5028,7 +4933,6 @@
                 <w:b w:val="false"/>
                 <w:bCs w:val="false"/>
                 <w:i w:val="false"/>
-                <w:i w:val="false"/>
                 <w:iCs w:val="false"/>
                 <w:sz w:val="22"/>
                 <w:szCs w:val="22"/>
@@ -5065,7 +4969,6 @@
                 <w:b w:val="false"/>
                 <w:bCs w:val="false"/>
                 <w:i w:val="false"/>
-                <w:i w:val="false"/>
                 <w:iCs w:val="false"/>
                 <w:sz w:val="22"/>
                 <w:szCs w:val="22"/>
@@ -5099,7 +5002,6 @@
                 <w:b w:val="false"/>
                 <w:bCs w:val="false"/>
                 <w:i w:val="false"/>
-                <w:i w:val="false"/>
                 <w:iCs w:val="false"/>
                 <w:sz w:val="22"/>
                 <w:szCs w:val="22"/>
@@ -5133,7 +5035,6 @@
                 <w:b w:val="false"/>
                 <w:bCs w:val="false"/>
                 <w:i w:val="false"/>
-                <w:i w:val="false"/>
                 <w:iCs w:val="false"/>
                 <w:sz w:val="22"/>
                 <w:szCs w:val="22"/>
@@ -5167,7 +5068,6 @@
                 <w:b w:val="false"/>
                 <w:bCs w:val="false"/>
                 <w:i w:val="false"/>
-                <w:i w:val="false"/>
                 <w:iCs w:val="false"/>
                 <w:sz w:val="22"/>
                 <w:szCs w:val="22"/>
@@ -5201,7 +5101,6 @@
                 <w:b w:val="false"/>
                 <w:bCs w:val="false"/>
                 <w:i w:val="false"/>
-                <w:i w:val="false"/>
                 <w:iCs w:val="false"/>
                 <w:sz w:val="22"/>
                 <w:szCs w:val="22"/>
@@ -5235,7 +5134,6 @@
                 <w:b w:val="false"/>
                 <w:bCs w:val="false"/>
                 <w:i w:val="false"/>
-                <w:i w:val="false"/>
                 <w:iCs w:val="false"/>
                 <w:sz w:val="22"/>
                 <w:szCs w:val="22"/>
@@ -5269,7 +5167,6 @@
                 <w:b w:val="false"/>
                 <w:bCs w:val="false"/>
                 <w:i w:val="false"/>
-                <w:i w:val="false"/>
                 <w:iCs w:val="false"/>
                 <w:sz w:val="22"/>
                 <w:szCs w:val="22"/>
@@ -5303,27 +5200,26 @@
                 <w:b w:val="false"/>
                 <w:bCs w:val="false"/>
                 <w:i w:val="false"/>
-                <w:i w:val="false"/>
-                <w:iCs w:val="false"/>
-                <w:sz w:val="22"/>
-                <w:szCs w:val="22"/>
-              </w:rPr>
-            </w:pPr>
-            <w:r>
-              <w:rPr>
-                <w:b w:val="false"/>
-                <w:bCs w:val="false"/>
-                <w:i w:val="false"/>
-                <w:iCs w:val="false"/>
-                <w:sz w:val="22"/>
-                <w:szCs w:val="22"/>
-              </w:rPr>
-            </w:r>
-          </w:p>
-        </w:tc>
-        <w:tc>
-          <w:tcPr>
-            <w:tcW w:w="1064" w:type="dxa"/>
+                <w:iCs w:val="false"/>
+                <w:sz w:val="22"/>
+                <w:szCs w:val="22"/>
+              </w:rPr>
+            </w:pPr>
+            <w:r>
+              <w:rPr>
+                <w:b w:val="false"/>
+                <w:bCs w:val="false"/>
+                <w:i w:val="false"/>
+                <w:iCs w:val="false"/>
+                <w:sz w:val="22"/>
+                <w:szCs w:val="22"/>
+              </w:rPr>
+            </w:r>
+          </w:p>
+        </w:tc>
+        <w:tc>
+          <w:tcPr>
+            <w:tcW w:w="1065" w:type="dxa"/>
             <w:tcBorders>
               <w:left w:val="single" w:sz="2" w:space="0" w:color="000000"/>
               <w:bottom w:val="single" w:sz="2" w:space="0" w:color="000000"/>
@@ -5338,7 +5234,6 @@
                 <w:b w:val="false"/>
                 <w:bCs w:val="false"/>
                 <w:i w:val="false"/>
-                <w:i w:val="false"/>
                 <w:iCs w:val="false"/>
                 <w:sz w:val="22"/>
                 <w:szCs w:val="22"/>
@@ -5375,7 +5270,6 @@
                 <w:b w:val="false"/>
                 <w:bCs w:val="false"/>
                 <w:i w:val="false"/>
-                <w:i w:val="false"/>
                 <w:iCs w:val="false"/>
                 <w:sz w:val="22"/>
                 <w:szCs w:val="22"/>
@@ -5409,7 +5303,6 @@
                 <w:b w:val="false"/>
                 <w:bCs w:val="false"/>
                 <w:i w:val="false"/>
-                <w:i w:val="false"/>
                 <w:iCs w:val="false"/>
                 <w:sz w:val="22"/>
                 <w:szCs w:val="22"/>
@@ -5443,7 +5336,6 @@
                 <w:b w:val="false"/>
                 <w:bCs w:val="false"/>
                 <w:i w:val="false"/>
-                <w:i w:val="false"/>
                 <w:iCs w:val="false"/>
                 <w:sz w:val="22"/>
                 <w:szCs w:val="22"/>
@@ -5477,7 +5369,6 @@
                 <w:b w:val="false"/>
                 <w:bCs w:val="false"/>
                 <w:i w:val="false"/>
-                <w:i w:val="false"/>
                 <w:iCs w:val="false"/>
                 <w:sz w:val="22"/>
                 <w:szCs w:val="22"/>
@@ -5511,7 +5402,6 @@
                 <w:b w:val="false"/>
                 <w:bCs w:val="false"/>
                 <w:i w:val="false"/>
-                <w:i w:val="false"/>
                 <w:iCs w:val="false"/>
                 <w:sz w:val="22"/>
                 <w:szCs w:val="22"/>
@@ -5545,7 +5435,6 @@
                 <w:b w:val="false"/>
                 <w:bCs w:val="false"/>
                 <w:i w:val="false"/>
-                <w:i w:val="false"/>
                 <w:iCs w:val="false"/>
                 <w:sz w:val="22"/>
                 <w:szCs w:val="22"/>
@@ -5579,7 +5468,6 @@
                 <w:b w:val="false"/>
                 <w:bCs w:val="false"/>
                 <w:i w:val="false"/>
-                <w:i w:val="false"/>
                 <w:iCs w:val="false"/>
                 <w:sz w:val="22"/>
                 <w:szCs w:val="22"/>
@@ -5613,27 +5501,26 @@
                 <w:b w:val="false"/>
                 <w:bCs w:val="false"/>
                 <w:i w:val="false"/>
-                <w:i w:val="false"/>
-                <w:iCs w:val="false"/>
-                <w:sz w:val="22"/>
-                <w:szCs w:val="22"/>
-              </w:rPr>
-            </w:pPr>
-            <w:r>
-              <w:rPr>
-                <w:b w:val="false"/>
-                <w:bCs w:val="false"/>
-                <w:i w:val="false"/>
-                <w:iCs w:val="false"/>
-                <w:sz w:val="22"/>
-                <w:szCs w:val="22"/>
-              </w:rPr>
-            </w:r>
-          </w:p>
-        </w:tc>
-        <w:tc>
-          <w:tcPr>
-            <w:tcW w:w="1064" w:type="dxa"/>
+                <w:iCs w:val="false"/>
+                <w:sz w:val="22"/>
+                <w:szCs w:val="22"/>
+              </w:rPr>
+            </w:pPr>
+            <w:r>
+              <w:rPr>
+                <w:b w:val="false"/>
+                <w:bCs w:val="false"/>
+                <w:i w:val="false"/>
+                <w:iCs w:val="false"/>
+                <w:sz w:val="22"/>
+                <w:szCs w:val="22"/>
+              </w:rPr>
+            </w:r>
+          </w:p>
+        </w:tc>
+        <w:tc>
+          <w:tcPr>
+            <w:tcW w:w="1065" w:type="dxa"/>
             <w:tcBorders>
               <w:left w:val="single" w:sz="2" w:space="0" w:color="000000"/>
               <w:bottom w:val="single" w:sz="2" w:space="0" w:color="000000"/>
@@ -5648,7 +5535,6 @@
                 <w:b w:val="false"/>
                 <w:bCs w:val="false"/>
                 <w:i w:val="false"/>
-                <w:i w:val="false"/>
                 <w:iCs w:val="false"/>
                 <w:sz w:val="22"/>
                 <w:szCs w:val="22"/>
@@ -5685,7 +5571,6 @@
                 <w:b w:val="false"/>
                 <w:bCs w:val="false"/>
                 <w:i w:val="false"/>
-                <w:i w:val="false"/>
                 <w:iCs w:val="false"/>
                 <w:sz w:val="22"/>
                 <w:szCs w:val="22"/>
@@ -5719,7 +5604,6 @@
                 <w:b w:val="false"/>
                 <w:bCs w:val="false"/>
                 <w:i w:val="false"/>
-                <w:i w:val="false"/>
                 <w:iCs w:val="false"/>
                 <w:sz w:val="22"/>
                 <w:szCs w:val="22"/>
@@ -5753,7 +5637,6 @@
                 <w:b w:val="false"/>
                 <w:bCs w:val="false"/>
                 <w:i w:val="false"/>
-                <w:i w:val="false"/>
                 <w:iCs w:val="false"/>
                 <w:sz w:val="22"/>
                 <w:szCs w:val="22"/>
@@ -5787,7 +5670,6 @@
                 <w:b w:val="false"/>
                 <w:bCs w:val="false"/>
                 <w:i w:val="false"/>
-                <w:i w:val="false"/>
                 <w:iCs w:val="false"/>
                 <w:sz w:val="22"/>
                 <w:szCs w:val="22"/>
@@ -5821,7 +5703,6 @@
                 <w:b w:val="false"/>
                 <w:bCs w:val="false"/>
                 <w:i w:val="false"/>
-                <w:i w:val="false"/>
                 <w:iCs w:val="false"/>
                 <w:sz w:val="22"/>
                 <w:szCs w:val="22"/>
@@ -5855,7 +5736,6 @@
                 <w:b w:val="false"/>
                 <w:bCs w:val="false"/>
                 <w:i w:val="false"/>
-                <w:i w:val="false"/>
                 <w:iCs w:val="false"/>
                 <w:sz w:val="22"/>
                 <w:szCs w:val="22"/>
@@ -5889,7 +5769,6 @@
                 <w:b w:val="false"/>
                 <w:bCs w:val="false"/>
                 <w:i w:val="false"/>
-                <w:i w:val="false"/>
                 <w:iCs w:val="false"/>
                 <w:sz w:val="22"/>
                 <w:szCs w:val="22"/>
@@ -5923,27 +5802,26 @@
                 <w:b w:val="false"/>
                 <w:bCs w:val="false"/>
                 <w:i w:val="false"/>
-                <w:i w:val="false"/>
-                <w:iCs w:val="false"/>
-                <w:sz w:val="22"/>
-                <w:szCs w:val="22"/>
-              </w:rPr>
-            </w:pPr>
-            <w:r>
-              <w:rPr>
-                <w:b w:val="false"/>
-                <w:bCs w:val="false"/>
-                <w:i w:val="false"/>
-                <w:iCs w:val="false"/>
-                <w:sz w:val="22"/>
-                <w:szCs w:val="22"/>
-              </w:rPr>
-            </w:r>
-          </w:p>
-        </w:tc>
-        <w:tc>
-          <w:tcPr>
-            <w:tcW w:w="1064" w:type="dxa"/>
+                <w:iCs w:val="false"/>
+                <w:sz w:val="22"/>
+                <w:szCs w:val="22"/>
+              </w:rPr>
+            </w:pPr>
+            <w:r>
+              <w:rPr>
+                <w:b w:val="false"/>
+                <w:bCs w:val="false"/>
+                <w:i w:val="false"/>
+                <w:iCs w:val="false"/>
+                <w:sz w:val="22"/>
+                <w:szCs w:val="22"/>
+              </w:rPr>
+            </w:r>
+          </w:p>
+        </w:tc>
+        <w:tc>
+          <w:tcPr>
+            <w:tcW w:w="1065" w:type="dxa"/>
             <w:tcBorders>
               <w:left w:val="single" w:sz="2" w:space="0" w:color="000000"/>
               <w:bottom w:val="single" w:sz="2" w:space="0" w:color="000000"/>
@@ -5957,7 +5835,6 @@
               <w:rPr>
                 <w:b w:val="false"/>
                 <w:bCs w:val="false"/>
-                <w:i w:val="false"/>
                 <w:i w:val="false"/>
                 <w:iCs w:val="false"/>
                 <w:sz w:val="22"/>
@@ -6194,7 +6071,7 @@
             <wp:inline distT="0" distB="0" distL="0" distR="0">
               <wp:extent cx="6135370" cy="34290"/>
               <wp:effectExtent l="0" t="0" r="0" b="0"/>
-              <wp:docPr id="6" name="Shape 2"/>
+              <wp:docPr id="5" name="Shape 2"/>
               <a:graphic xmlns:a="http://schemas.openxmlformats.org/drawingml/2006/main">
                 <a:graphicData uri="http://schemas.microsoft.com/office/word/2010/wordprocessingShape">
                   <wps:wsp>
@@ -6231,7 +6108,7 @@
         </mc:Choice>
         <mc:Fallback>
           <w:pict>
-            <v:rect id="shape_0" ID="Shape 2" path="m0,0l-2147483645,0l-2147483645,-2147483646l0,-2147483646xe" fillcolor="white" stroked="t" o:allowincell="f" style="position:absolute;margin-left:0pt;margin-top:-2.75pt;width:483.05pt;height:2.65pt;mso-wrap-style:none;v-text-anchor:middle;mso-position-vertical:top">
+            <v:rect id="shape_0" fillcolor="white" stroked="t" o:allowincell="f" style="position:absolute;margin-left:0pt;margin-top:-2.75pt;width:483.05pt;height:2.65pt;mso-wrap-style:none;v-text-anchor:middle;mso-position-vertical:top">
               <v:fill o:detectmouseclick="t" type="solid" color2="black"/>
               <v:stroke color="black" joinstyle="round" endcap="flat"/>
               <w10:wrap type="square"/>
@@ -6258,10 +6135,12 @@
       <w:gridCol w:w="4707"/>
       <w:gridCol w:w="3084"/>
       <w:gridCol w:w="845"/>
-      <w:gridCol w:w="985"/>
+      <w:gridCol w:w="986"/>
     </w:tblGrid>
     <w:tr>
-      <w:trPr/>
+      <w:trPr>
+        <w:trHeight w:val="920" w:hRule="atLeast"/>
+      </w:trPr>
       <w:tc>
         <w:tcPr>
           <w:tcW w:w="4707" w:type="dxa"/>
@@ -6276,8 +6155,7 @@
             <w:ind w:hanging="0" w:left="0" w:right="0"/>
             <w:jc w:val="center"/>
             <w:rPr>
-              <w:sz w:val="20"/>
-              <w:szCs w:val="20"/>
+              <w:lang w:val="en-US" w:eastAsia="en-US" w:bidi="ar-SA"/>
             </w:rPr>
           </w:pPr>
           <w:r>
@@ -6289,9 +6167,48 @@
               <w:kern w:val="0"/>
               <w:sz w:val="20"/>
               <w:szCs w:val="20"/>
-              <w:lang w:val="pt-BR" w:eastAsia="en-US" w:bidi="ar-SA"/>
+              <w:lang w:val="en-US" w:eastAsia="en-US" w:bidi="ar-SA"/>
             </w:rPr>
-            <w:t>FF Consultoria em Bioestatística e Epidemiologia</w:t>
+            <w:t xml:space="preserve">FF </w:t>
+          </w:r>
+          <w:r>
+            <w:rPr>
+              <w:rFonts w:eastAsia="Cambria" w:cs="" w:cstheme="minorBidi" w:eastAsiaTheme="minorHAnsi"/>
+              <w:b/>
+              <w:bCs/>
+              <w:color w:val="auto"/>
+              <w:kern w:val="0"/>
+              <w:sz w:val="20"/>
+              <w:szCs w:val="20"/>
+              <w:lang w:val="en-US" w:eastAsia="en-US" w:bidi="ar-SA"/>
+            </w:rPr>
+            <w:t>Consulting</w:t>
+          </w:r>
+          <w:r>
+            <w:rPr>
+              <w:rFonts w:eastAsia="Cambria" w:cs="" w:cstheme="minorBidi" w:eastAsiaTheme="minorHAnsi"/>
+              <w:b/>
+              <w:bCs/>
+              <w:color w:val="auto"/>
+              <w:kern w:val="0"/>
+              <w:sz w:val="20"/>
+              <w:szCs w:val="20"/>
+              <w:lang w:val="en-US" w:eastAsia="en-US" w:bidi="ar-SA"/>
+            </w:rPr>
+            <w:t xml:space="preserve"> </w:t>
+          </w:r>
+          <w:r>
+            <w:rPr>
+              <w:rFonts w:eastAsia="Cambria" w:cs="" w:cstheme="minorBidi" w:eastAsiaTheme="minorHAnsi"/>
+              <w:b/>
+              <w:bCs/>
+              <w:color w:val="auto"/>
+              <w:kern w:val="0"/>
+              <w:sz w:val="20"/>
+              <w:szCs w:val="20"/>
+              <w:lang w:val="en-US" w:eastAsia="en-US" w:bidi="ar-SA"/>
+            </w:rPr>
+            <w:t>In Biostatistics and Epidemiology</w:t>
           </w:r>
         </w:p>
         <w:p>
@@ -6302,8 +6219,7 @@
             <w:ind w:hanging="0" w:left="0" w:right="0"/>
             <w:jc w:val="center"/>
             <w:rPr>
-              <w:sz w:val="20"/>
-              <w:szCs w:val="20"/>
+              <w:lang w:val="en-US" w:eastAsia="en-US" w:bidi="ar-SA"/>
             </w:rPr>
           </w:pPr>
           <w:r>
@@ -6315,7 +6231,7 @@
               <w:kern w:val="0"/>
               <w:sz w:val="20"/>
               <w:szCs w:val="20"/>
-              <w:lang w:val="pt-BR" w:eastAsia="en-US" w:bidi="ar-SA"/>
+              <w:lang w:val="en-US" w:eastAsia="en-US" w:bidi="ar-SA"/>
             </w:rPr>
             <w:t>CNPJ: 42.154.074/0001-22</w:t>
           </w:r>
@@ -6333,13 +6249,6 @@
             <w:widowControl w:val="false"/>
             <w:jc w:val="center"/>
             <w:rPr>
-              <w:rFonts w:ascii="Ubuntu" w:hAnsi="Ubuntu" w:eastAsia="Liberation Mono" w:cs="Liberation Mono"/>
-              <w:b/>
-              <w:bCs/>
-              <w:color w:val="auto"/>
-              <w:kern w:val="0"/>
-              <w:sz w:val="20"/>
-              <w:szCs w:val="20"/>
               <w:lang w:val="en-US" w:eastAsia="en-US" w:bidi="ar-SA"/>
             </w:rPr>
           </w:pPr>
@@ -6369,7 +6278,9 @@
             <w:pStyle w:val="CabealhoeRodap"/>
             <w:widowControl w:val="false"/>
             <w:jc w:val="center"/>
-            <w:rPr/>
+            <w:rPr>
+              <w:lang w:val="en-US" w:eastAsia="en-US" w:bidi="ar-SA"/>
+            </w:rPr>
           </w:pPr>
           <w:r>
             <w:rPr>
@@ -6420,7 +6331,7 @@
             <w:widowControl w:val="false"/>
             <w:jc w:val="center"/>
             <w:rPr>
-              <w:rFonts w:ascii="Ubuntu Mono" w:hAnsi="Ubuntu Mono"/>
+              <w:lang w:val="en-US" w:eastAsia="en-US" w:bidi="ar-SA"/>
             </w:rPr>
           </w:pPr>
           <w:r>
@@ -6435,7 +6346,7 @@
       </w:tc>
       <w:tc>
         <w:tcPr>
-          <w:tcW w:w="985" w:type="dxa"/>
+          <w:tcW w:w="986" w:type="dxa"/>
           <w:tcBorders/>
           <w:vAlign w:val="center"/>
         </w:tcPr>
@@ -6444,7 +6355,9 @@
             <w:pStyle w:val="CabealhoeRodap"/>
             <w:widowControl w:val="false"/>
             <w:jc w:val="center"/>
-            <w:rPr/>
+            <w:rPr>
+              <w:lang w:val="en-US" w:eastAsia="en-US" w:bidi="ar-SA"/>
+            </w:rPr>
           </w:pPr>
           <w:r>
             <w:rPr>
@@ -6486,7 +6399,7 @@
             <w:widowControl w:val="false"/>
             <w:jc w:val="center"/>
             <w:rPr>
-              <w:rFonts w:ascii="Ubuntu Mono" w:hAnsi="Ubuntu Mono"/>
+              <w:lang w:val="en-US" w:eastAsia="en-US" w:bidi="ar-SA"/>
             </w:rPr>
           </w:pPr>
           <w:r>
@@ -6620,7 +6533,7 @@
             <wp:inline distT="0" distB="0" distL="0" distR="0">
               <wp:extent cx="6135370" cy="34290"/>
               <wp:effectExtent l="0" t="0" r="0" b="0"/>
-              <wp:docPr id="7" name="Shape 4"/>
+              <wp:docPr id="6" name="Shape 4"/>
               <a:graphic xmlns:a="http://schemas.openxmlformats.org/drawingml/2006/main">
                 <a:graphicData uri="http://schemas.microsoft.com/office/word/2010/wordprocessingShape">
                   <wps:wsp>
@@ -6657,7 +6570,7 @@
         </mc:Choice>
         <mc:Fallback>
           <w:pict>
-            <v:rect id="shape_0" ID="Shape 4" path="m0,0l-2147483645,0l-2147483645,-2147483646l0,-2147483646xe" fillcolor="white" stroked="t" o:allowincell="f" style="position:absolute;margin-left:0pt;margin-top:-2.75pt;width:483.05pt;height:2.65pt;mso-wrap-style:none;v-text-anchor:middle;mso-position-vertical:top">
+            <v:rect id="shape_0" fillcolor="white" stroked="t" o:allowincell="f" style="position:absolute;margin-left:0pt;margin-top:-2.75pt;width:483.05pt;height:2.65pt;mso-wrap-style:none;v-text-anchor:middle;mso-position-vertical:top">
               <v:fill o:detectmouseclick="t" type="solid" color2="black"/>
               <v:stroke color="black" joinstyle="round" endcap="flat"/>
               <w10:wrap type="square"/>
@@ -6813,7 +6726,7 @@
           </v:handles>
           <o:lock v:ext="edit" text="t" shapetype="t"/>
         </v:shapetype>
-        <v:shape id="PowerPlusWaterMarkObject 1" o:spid="shape_0" adj="10800" fillcolor="silver" stroked="f" o:allowincell="f" style="position:absolute;margin-left:7.8pt;margin-top:235.55pt;width:466.35pt;height:164.15pt;mso-wrap-style:none;v-text-anchor:middle;rotation:315;mso-position-horizontal:center;mso-position-horizontal-relative:margin;mso-position-vertical:center;mso-position-vertical-relative:margin" type="_x0000_t136">
+        <v:shape id="PowerPlusWaterMarkObject 1" o:spid="shape_0" adj="10800" fillcolor="silver" stroked="f" o:allowincell="f" style="position:absolute;margin-left:7.75pt;margin-top:231.1pt;width:466.3pt;height:164.1pt;mso-wrap-style:none;v-text-anchor:middle;rotation:315;mso-position-horizontal:center;mso-position-horizontal-relative:margin;mso-position-vertical:center;mso-position-vertical-relative:margin" type="_x0000_t136">
           <v:path textpathok="t"/>
           <v:textpath on="t" fitshape="t" string="DRAFT" style="font-family:&quot;Ubuntu&quot;;font-size:1pt" trim="t"/>
           <v:fill o:detectmouseclick="t" type="solid" color2="#3f3f3f" opacity="0.5"/>
@@ -6827,7 +6740,7 @@
             <wp:inline distT="0" distB="0" distL="0" distR="0">
               <wp:extent cx="6135370" cy="34290"/>
               <wp:effectExtent l="0" t="0" r="0" b="0"/>
-              <wp:docPr id="3" name="Shape 1"/>
+              <wp:docPr id="2" name="Shape 1"/>
               <a:graphic xmlns:a="http://schemas.openxmlformats.org/drawingml/2006/main">
                 <a:graphicData uri="http://schemas.microsoft.com/office/word/2010/wordprocessingShape">
                   <wps:wsp>
@@ -6864,7 +6777,7 @@
         </mc:Choice>
         <mc:Fallback>
           <w:pict>
-            <v:rect id="shape_0" ID="Shape 1" path="m0,0l-2147483645,0l-2147483645,-2147483646l0,-2147483646xe" fillcolor="white" stroked="t" o:allowincell="f" style="position:absolute;margin-left:0pt;margin-top:-2.75pt;width:483.05pt;height:2.65pt;mso-wrap-style:none;v-text-anchor:middle;mso-position-vertical:top">
+            <v:rect id="shape_0" fillcolor="white" stroked="t" o:allowincell="f" style="position:absolute;margin-left:0pt;margin-top:-2.75pt;width:483.05pt;height:2.65pt;mso-wrap-style:none;v-text-anchor:middle;mso-position-vertical:top">
               <v:fill o:detectmouseclick="t" type="solid" color2="black"/>
               <v:stroke color="black" joinstyle="round" endcap="flat"/>
               <w10:wrap type="square"/>
@@ -7004,22 +6917,87 @@
     </w:pPr>
     <w:r>
       <w:rPr/>
-      <w:pict>
-        <v:shape id="PowerPlusWaterMarkObject 2" o:spid="shape_0" adj="10800" fillcolor="silver" stroked="f" o:allowincell="f" style="position:absolute;margin-left:239.4pt;margin-top:324.65pt;width:3.1pt;height:1.15pt;mso-wrap-style:none;v-text-anchor:middle;rotation:315;mso-position-horizontal:center;mso-position-horizontal-relative:margin;mso-position-vertical:center;mso-position-vertical-relative:margin" type="_x0000_t136">
-          <v:path textpathok="t"/>
-          <v:textpath on="t" fitshape="t" string="DRAFT" style="font-family:&quot;Ubuntu&quot;;font-size:1pt" trim="t"/>
-          <v:fill o:detectmouseclick="t" type="solid" color2="#3f3f3f"/>
-          <v:stroke color="#3465a4" joinstyle="round" endcap="flat"/>
-          <w10:wrap type="none"/>
-        </v:shape>
-      </w:pict>
+      <mc:AlternateContent>
+        <mc:Choice Requires="wps">
+          <w:drawing>
+            <wp:anchor distT="0" distB="0" distL="114300" distR="0" simplePos="0" relativeHeight="32" behindDoc="1" locked="0" layoutInCell="0" allowOverlap="1">
+              <wp:simplePos x="0" y="0"/>
+              <wp:positionH relativeFrom="margin">
+                <wp:align>center</wp:align>
+              </wp:positionH>
+              <wp:positionV relativeFrom="margin">
+                <wp:align>center</wp:align>
+              </wp:positionV>
+              <wp:extent cx="40005" cy="15240"/>
+              <wp:effectExtent l="3040380" t="4122420" r="0" b="0"/>
+              <wp:wrapNone/>
+              <wp:docPr id="3" name="PowerPlusWaterMarkObject 2"/>
+              <a:graphic xmlns:a="http://schemas.openxmlformats.org/drawingml/2006/main">
+                <a:graphicData uri="http://schemas.microsoft.com/office/word/2010/wordprocessingShape">
+                  <wps:wsp>
+                    <wps:cNvSpPr txBox="1"/>
+                    <wps:spPr>
+                      <a:xfrm rot="18900000">
+                        <a:off x="0" y="0"/>
+                        <a:ext cx="39960" cy="15120"/>
+                      </a:xfrm>
+                      <a:prstGeom prst="rect">
+                        <a:avLst/>
+                      </a:prstGeom>
+                    </wps:spPr>
+                    <wps:txbx>
+                      <w:txbxContent>
+                        <w:p>
+                          <w:pPr>
+                            <w:overflowPunct w:val="false"/>
+                            <w:spacing w:before="0" w:after="0"/>
+                            <w:rPr/>
+                          </w:pPr>
+                          <w:r>
+                            <w:rPr>
+                              <w:rFonts w:ascii="Ubuntu" w:hAnsi="Ubuntu" w:cstheme="minorBidi"/>
+                              <w:color w:val="C0C0C0"/>
+                              <w:sz w:val="2"/>
+                              <w14:textOutline w14:w="0" w14:cap="flat" w14:cmpd="sng">
+                                <w14:noFill/>
+                                <w14:round/>
+                              </w14:textOutline>
+                              <w14:textFill>
+                                <w14:solidFill>
+                                  <w14:srgbClr w14:val="c0c0c0"/>
+                                </w14:solidFill>
+                              </w14:textFill>
+                            </w:rPr>
+                            <w:t>DRAFT</w:t>
+                          </w:r>
+                        </w:p>
+                      </w:txbxContent>
+                    </wps:txbx>
+                    <wps:bodyPr wrap="square" lIns="0" rIns="0" tIns="0" bIns="0" anchor="ctr">
+                      <a:prstTxWarp prst="textPlain">
+                        <a:avLst>
+                          <a:gd name="adj" fmla="val 50000"/>
+                        </a:avLst>
+                      </a:prstTxWarp>
+                      <a:noAutofit/>
+                    </wps:bodyPr>
+                  </wps:wsp>
+                </a:graphicData>
+              </a:graphic>
+            </wp:anchor>
+          </w:drawing>
+        </mc:Choice>
+        <mc:Fallback>
+          <w:pict/>
+        </mc:Fallback>
+      </mc:AlternateContent>
       <mc:AlternateContent>
         <mc:Choice Requires="wps">
           <w:drawing>
             <wp:inline distT="0" distB="0" distL="0" distR="0">
               <wp:extent cx="6135370" cy="34290"/>
               <wp:effectExtent l="0" t="0" r="0" b="0"/>
-              <wp:docPr id="5" name="Shape 3"/>
+              <wp:docPr id="4" name="Shape 3"/>
               <a:graphic xmlns:a="http://schemas.openxmlformats.org/drawingml/2006/main">
                 <a:graphicData uri="http://schemas.microsoft.com/office/word/2010/wordprocessingShape">
                   <wps:wsp>
@@ -7056,7 +7034,7 @@
         </mc:Choice>
         <mc:Fallback>
           <w:pict>
-            <v:rect id="shape_0" ID="Shape 3" path="m0,0l-2147483645,0l-2147483645,-2147483646l0,-2147483646xe" fillcolor="white" stroked="t" o:allowincell="f" style="position:absolute;margin-left:0pt;margin-top:-2.75pt;width:483.05pt;height:2.65pt;mso-wrap-style:none;v-text-anchor:middle;mso-position-vertical:top">
+            <v:rect id="shape_0" fillcolor="white" stroked="t" o:allowincell="f" style="position:absolute;margin-left:0pt;margin-top:-2.75pt;width:483.05pt;height:2.65pt;mso-wrap-style:none;v-text-anchor:middle;mso-position-vertical:top">
               <v:fill o:detectmouseclick="t" type="solid" color2="black"/>
               <v:stroke color="black" joinstyle="round" endcap="flat"/>
               <w10:wrap type="square"/>
@@ -7074,8 +7052,8 @@
   <w:abstractNum w:abstractNumId="1">
     <w:lvl w:ilvl="0">
       <w:start w:val="1"/>
+      <w:numFmt w:val="decimal"/>
       <w:pStyle w:val="Heading1"/>
-      <w:numFmt w:val="decimal"/>
       <w:lvlText w:val=" %1 "/>
       <w:lvlJc w:val="left"/>
       <w:pPr>
@@ -7088,8 +7066,8 @@
     </w:lvl>
     <w:lvl w:ilvl="1">
       <w:start w:val="1"/>
+      <w:numFmt w:val="decimal"/>
       <w:pStyle w:val="Heading2"/>
-      <w:numFmt w:val="decimal"/>
       <w:lvlText w:val=" %1.%2 "/>
       <w:lvlJc w:val="left"/>
       <w:pPr>
@@ -7102,8 +7080,8 @@
     </w:lvl>
     <w:lvl w:ilvl="2">
       <w:start w:val="1"/>
+      <w:numFmt w:val="decimal"/>
       <w:pStyle w:val="Heading3"/>
-      <w:numFmt w:val="decimal"/>
       <w:lvlText w:val=" %1.%2.%3 "/>
       <w:lvlJc w:val="left"/>
       <w:pPr>
@@ -7116,8 +7094,8 @@
     </w:lvl>
     <w:lvl w:ilvl="3">
       <w:start w:val="1"/>
+      <w:numFmt w:val="decimal"/>
       <w:pStyle w:val="Heading4"/>
-      <w:numFmt w:val="decimal"/>
       <w:lvlText w:val=" %1.%2.%3.%4 "/>
       <w:lvlJc w:val="left"/>
       <w:pPr>
@@ -7130,8 +7108,8 @@
     </w:lvl>
     <w:lvl w:ilvl="4">
       <w:start w:val="1"/>
+      <w:numFmt w:val="decimal"/>
       <w:pStyle w:val="Heading5"/>
-      <w:numFmt w:val="decimal"/>
       <w:lvlText w:val=" %1.%2.%3.%4.%5 "/>
       <w:lvlJc w:val="left"/>
       <w:pPr>
@@ -7144,8 +7122,8 @@
     </w:lvl>
     <w:lvl w:ilvl="5">
       <w:start w:val="1"/>
+      <w:numFmt w:val="decimal"/>
       <w:pStyle w:val="Heading6"/>
-      <w:numFmt w:val="decimal"/>
       <w:lvlText w:val=" %1.%2.%3.%4.%5.%6 "/>
       <w:lvlJc w:val="left"/>
       <w:pPr>
@@ -7158,8 +7136,8 @@
     </w:lvl>
     <w:lvl w:ilvl="6">
       <w:start w:val="1"/>
+      <w:numFmt w:val="decimal"/>
       <w:pStyle w:val="Heading7"/>
-      <w:numFmt w:val="decimal"/>
       <w:lvlText w:val=" %1.%2.%3.%4.%5.%6.%7 "/>
       <w:lvlJc w:val="left"/>
       <w:pPr>
@@ -7172,8 +7150,8 @@
     </w:lvl>
     <w:lvl w:ilvl="7">
       <w:start w:val="1"/>
+      <w:numFmt w:val="decimal"/>
       <w:pStyle w:val="Heading8"/>
-      <w:numFmt w:val="decimal"/>
       <w:lvlText w:val=" %1.%2.%3.%4.%5.%6.%7.%8 "/>
       <w:lvlJc w:val="left"/>
       <w:pPr>
@@ -7186,8 +7164,8 @@
     </w:lvl>
     <w:lvl w:ilvl="8">
       <w:start w:val="1"/>
+      <w:numFmt w:val="decimal"/>
       <w:pStyle w:val="Heading9"/>
-      <w:numFmt w:val="decimal"/>
       <w:lvlText w:val=" %1.%2.%3.%4.%5.%6.%7.%8.%9 "/>
       <w:lvlJc w:val="left"/>
       <w:pPr>
@@ -7764,8 +7742,8 @@
       <w:vertAlign w:val="superscript"/>
     </w:rPr>
   </w:style>
-  <w:style w:type="character" w:styleId="FootnoteCharactersuser">
-    <w:name w:val="Footnote Characters (user)"/>
+  <w:style w:type="character" w:styleId="FootnoteCharacters">
+    <w:name w:val="Footnote Characters"/>
     <w:basedOn w:val="BodyTextChar"/>
     <w:qFormat/>
     <w:rPr>
@@ -8855,8 +8833,8 @@
       <w:bCs/>
     </w:rPr>
   </w:style>
-  <w:style w:type="paragraph" w:styleId="FrameContents">
-    <w:name w:val="Frame Contents"/>
+  <w:style w:type="paragraph" w:styleId="FrameContentsuser">
+    <w:name w:val="Frame Contents (user)"/>
     <w:basedOn w:val="Normal"/>
     <w:qFormat/>
     <w:pPr/>

</xml_diff>